<commit_message>
Fix ISBN / Update under syllabi
</commit_message>
<xml_diff>
--- a/Undergraduate/Courses/MTH125/MTH125_Orientation_2day_template.docx
+++ b/Undergraduate/Courses/MTH125/MTH125_Orientation_2day_template.docx
@@ -13,7 +13,6 @@
           <w:szCs w:val="20"/>
         </w:rPr>
       </w:pPr>
-      <w:proofErr w:type="spellStart"/>
       <w:r>
         <w:rPr>
           <w:rFonts w:ascii="Arial" w:hAnsi="Arial" w:cs="Arial"/>
@@ -22,18 +21,7 @@
           <w:sz w:val="20"/>
           <w:szCs w:val="20"/>
         </w:rPr>
-        <w:t>Term</w:t>
-      </w:r>
-      <w:proofErr w:type="spellEnd"/>
-      <w:r>
-        <w:rPr>
-          <w:rFonts w:ascii="Arial" w:hAnsi="Arial" w:cs="Arial"/>
-          <w:b/>
-          <w:bCs/>
-          <w:sz w:val="20"/>
-          <w:szCs w:val="20"/>
-        </w:rPr>
-        <w:t>:</w:t>
+        <w:t>Term:</w:t>
       </w:r>
       <w:r>
         <w:rPr>
@@ -286,7 +274,6 @@
           <w:szCs w:val="20"/>
         </w:rPr>
       </w:pPr>
-      <w:proofErr w:type="gramStart"/>
       <w:r>
         <w:rPr>
           <w:rFonts w:ascii="Arial" w:hAnsi="Arial" w:cs="Arial"/>
@@ -295,18 +282,7 @@
           <w:sz w:val="20"/>
           <w:szCs w:val="20"/>
         </w:rPr>
-        <w:t>Email</w:t>
-      </w:r>
-      <w:proofErr w:type="gramEnd"/>
-      <w:r>
-        <w:rPr>
-          <w:rFonts w:ascii="Arial" w:hAnsi="Arial" w:cs="Arial"/>
-          <w:b/>
-          <w:bCs/>
-          <w:sz w:val="20"/>
-          <w:szCs w:val="20"/>
-        </w:rPr>
-        <w:t>:</w:t>
+        <w:t>Email:</w:t>
       </w:r>
       <w:r>
         <w:rPr>
@@ -473,29 +449,7 @@
           <w:u w:color="000000"/>
           <w:lang w:val="en-US"/>
         </w:rPr>
-        <w:t xml:space="preserve">In class you will be expected to participate in problem solving in addition to taking notes from lecture. Topics </w:t>
-      </w:r>
-      <w:proofErr w:type="gramStart"/>
-      <w:r>
-        <w:rPr>
-          <w:rFonts w:ascii="Arial" w:hAnsi="Arial" w:cs="Arial"/>
-          <w:sz w:val="20"/>
-          <w:szCs w:val="20"/>
-          <w:u w:color="000000"/>
-          <w:lang w:val="en-US"/>
-        </w:rPr>
-        <w:t>include:</w:t>
-      </w:r>
-      <w:proofErr w:type="gramEnd"/>
-      <w:r>
-        <w:rPr>
-          <w:rFonts w:ascii="Arial" w:hAnsi="Arial" w:cs="Arial"/>
-          <w:sz w:val="20"/>
-          <w:szCs w:val="20"/>
-          <w:u w:color="000000"/>
-          <w:lang w:val="en-US"/>
-        </w:rPr>
-        <w:t xml:space="preserve"> review of basic algebra; inequalities; logarithmic, exponential, and trigonometric functions; graphs and equations; inverse functions; elements of analytic geometry. Introduction to the use of graphing calculators. Includes a review of selected topics from Intermediate Algebra.</w:t>
+        <w:t>In class you will be expected to participate in problem solving in addition to taking notes from lecture. Topics include: review of basic algebra; inequalities; logarithmic, exponential, and trigonometric functions; graphs and equations; inverse functions; elements of analytic geometry. Introduction to the use of graphing calculators. Includes a review of selected topics from Intermediate Algebra.</w:t>
       </w:r>
     </w:p>
     <w:p>
@@ -549,7 +503,6 @@
           <w:szCs w:val="20"/>
         </w:rPr>
       </w:pPr>
-      <w:proofErr w:type="spellStart"/>
       <w:r>
         <w:rPr>
           <w:rFonts w:ascii="Arial" w:hAnsi="Arial" w:cs="Arial"/>
@@ -561,7 +514,6 @@
         </w:rPr>
         <w:t>Textbook</w:t>
       </w:r>
-      <w:proofErr w:type="spellEnd"/>
       <w:r>
         <w:rPr>
           <w:rFonts w:ascii="Arial" w:eastAsia="Times New Roman" w:hAnsi="Arial" w:cs="Arial"/>
@@ -590,27 +542,7 @@
           <w:szCs w:val="20"/>
           <w:lang w:val="en-US"/>
         </w:rPr>
-        <w:t xml:space="preserve">, by Robert Blitzer; Pearson (2022), MTH 125 CSI Custom version; ISBN 97801359052344. This is accompanied by a mandatory online homework platform on </w:t>
-      </w:r>
-      <w:proofErr w:type="spellStart"/>
-      <w:r>
-        <w:rPr>
-          <w:rFonts w:ascii="Arial" w:hAnsi="Arial" w:cs="Arial"/>
-          <w:sz w:val="20"/>
-          <w:szCs w:val="20"/>
-          <w:lang w:val="en-US"/>
-        </w:rPr>
-        <w:t>MyLab</w:t>
-      </w:r>
-      <w:proofErr w:type="spellEnd"/>
-      <w:r>
-        <w:rPr>
-          <w:rFonts w:ascii="Arial" w:hAnsi="Arial" w:cs="Arial"/>
-          <w:sz w:val="20"/>
-          <w:szCs w:val="20"/>
-          <w:lang w:val="en-US"/>
-        </w:rPr>
-        <w:t xml:space="preserve"> Math.</w:t>
+        <w:t>, by Robert Blitzer; Pearson (2022), MTH 125 CSI Custom version; ISBN 9780135905234. This is accompanied by a mandatory online homework platform on MyLab Math.</w:t>
       </w:r>
     </w:p>
     <w:p>
@@ -670,27 +602,7 @@
           <w:szCs w:val="20"/>
           <w:lang w:val="en-US"/>
         </w:rPr>
-        <w:t xml:space="preserve">Have a notebook dedicated to this </w:t>
-      </w:r>
-      <w:proofErr w:type="gramStart"/>
-      <w:r>
-        <w:rPr>
-          <w:rFonts w:ascii="Arial" w:hAnsi="Arial" w:cs="Arial"/>
-          <w:sz w:val="20"/>
-          <w:szCs w:val="20"/>
-          <w:lang w:val="en-US"/>
-        </w:rPr>
-        <w:t>course, and</w:t>
-      </w:r>
-      <w:proofErr w:type="gramEnd"/>
-      <w:r>
-        <w:rPr>
-          <w:rFonts w:ascii="Arial" w:hAnsi="Arial" w:cs="Arial"/>
-          <w:sz w:val="20"/>
-          <w:szCs w:val="20"/>
-          <w:lang w:val="en-US"/>
-        </w:rPr>
-        <w:t xml:space="preserve"> bring it to class. Use it for your lecture notes, outlines of assigned reading, and attempting homework problems.</w:t>
+        <w:t>Have a notebook dedicated to this course, and bring it to class. Use it for your lecture notes, outlines of assigned reading, and attempting homework problems.</w:t>
       </w:r>
     </w:p>
     <w:p>
@@ -716,7 +628,6 @@
           <w:szCs w:val="20"/>
         </w:rPr>
       </w:pPr>
-      <w:proofErr w:type="spellStart"/>
       <w:r>
         <w:rPr>
           <w:rFonts w:ascii="Arial" w:hAnsi="Arial" w:cs="Arial"/>
@@ -727,7 +638,6 @@
         </w:rPr>
         <w:t>Calculator</w:t>
       </w:r>
-      <w:proofErr w:type="spellEnd"/>
     </w:p>
     <w:p>
       <w:pPr>
@@ -887,27 +797,7 @@
           <w:szCs w:val="20"/>
           <w:lang w:val="en-US"/>
         </w:rPr>
-        <w:t xml:space="preserve">Homework assignments are to be completed online on </w:t>
-      </w:r>
-      <w:proofErr w:type="spellStart"/>
-      <w:r>
-        <w:rPr>
-          <w:rFonts w:ascii="Arial" w:hAnsi="Arial" w:cs="Arial"/>
-          <w:sz w:val="20"/>
-          <w:szCs w:val="20"/>
-          <w:lang w:val="en-US"/>
-        </w:rPr>
-        <w:t>MyLab</w:t>
-      </w:r>
-      <w:proofErr w:type="spellEnd"/>
-      <w:r>
-        <w:rPr>
-          <w:rFonts w:ascii="Arial" w:hAnsi="Arial" w:cs="Arial"/>
-          <w:sz w:val="20"/>
-          <w:szCs w:val="20"/>
-          <w:lang w:val="en-US"/>
-        </w:rPr>
-        <w:t xml:space="preserve"> Math. If you have trouble with the platform, contact Pearson customer support. There will be an assignment after every class in which new material is introduced, due by the end of the following week.</w:t>
+        <w:t>Homework assignments are to be completed online on MyLab Math. If you have trouble with the platform, contact Pearson customer support. There will be an assignment after every class in which new material is introduced, due by the end of the following week.</w:t>
       </w:r>
     </w:p>
     <w:p>
@@ -965,27 +855,7 @@
           <w:szCs w:val="20"/>
           <w:lang w:val="en-US"/>
         </w:rPr>
-        <w:t>There will be four mid-term exams and a final. The mid-terms will be non-</w:t>
-      </w:r>
-      <w:proofErr w:type="gramStart"/>
-      <w:r>
-        <w:rPr>
-          <w:rFonts w:ascii="Arial" w:hAnsi="Arial" w:cs="Arial"/>
-          <w:sz w:val="20"/>
-          <w:szCs w:val="20"/>
-          <w:lang w:val="en-US"/>
-        </w:rPr>
-        <w:t>cumulative</w:t>
-      </w:r>
-      <w:proofErr w:type="gramEnd"/>
-      <w:r>
-        <w:rPr>
-          <w:rFonts w:ascii="Arial" w:hAnsi="Arial" w:cs="Arial"/>
-          <w:sz w:val="20"/>
-          <w:szCs w:val="20"/>
-          <w:lang w:val="en-US"/>
-        </w:rPr>
-        <w:t xml:space="preserve"> and the final will be cumulative. A set of practice problems will be distributed two classes before each exam. You will be expected to complete that by the next class. There will be no make-up exams. If you have a reason for missing an exam that is consistent with CUNY policy, email your instructors about this as soon as possible. The date and time of the final exam will be determined by the college; without exception, that is the only time at which you can take the final exam.</w:t>
+        <w:t>There will be four mid-term exams and a final. The mid-terms will be non-cumulative and the final will be cumulative. A set of practice problems will be distributed two classes before each exam. You will be expected to complete that by the next class. There will be no make-up exams. If you have a reason for missing an exam that is consistent with CUNY policy, email your instructors about this as soon as possible. The date and time of the final exam will be determined by the college; without exception, that is the only time at which you can take the final exam.</w:t>
       </w:r>
     </w:p>
     <w:p>
@@ -1328,7 +1198,6 @@
           <w:szCs w:val="20"/>
         </w:rPr>
       </w:pPr>
-      <w:proofErr w:type="gramStart"/>
       <w:r>
         <w:rPr>
           <w:rFonts w:ascii="Arial" w:hAnsi="Arial" w:cs="Arial"/>
@@ -1338,19 +1207,7 @@
           <w:szCs w:val="20"/>
           <w:lang w:val="de-DE"/>
         </w:rPr>
-        <w:t>CUNY Dates</w:t>
-      </w:r>
-      <w:proofErr w:type="gramEnd"/>
-      <w:r>
-        <w:rPr>
-          <w:rFonts w:ascii="Arial" w:hAnsi="Arial" w:cs="Arial"/>
-          <w:b/>
-          <w:bCs/>
-          <w:sz w:val="20"/>
-          <w:szCs w:val="20"/>
-          <w:lang w:val="de-DE"/>
-        </w:rPr>
-        <w:t xml:space="preserve">: </w:t>
+        <w:t xml:space="preserve">CUNY Dates: </w:t>
       </w:r>
       <w:hyperlink r:id="rId7" w:history="1">
         <w:r>

</xml_diff>